<commit_message>
fix: anti-overclaiming language in Papers A/B/C (10 text fixes, no formulas) - Paper A: 6 fixes (systematic error->deterministic bias, tested today->future platforms, measurable->modelable, scaling caveats added) - Paper B: 3 fixes (dominant->non-negligible, measurable->modelable in text+table) - Paper C: 1 fix (measurable->predictable gradients)
</commit_message>
<xml_diff>
--- a/paper_final/SSZ_Paper_A_Segmented Spacetime Geometry for Qubit Optimization_repaired.docx
+++ b/paper_final/SSZ_Paper_A_Segmented Spacetime Geometry for Qubit Optimization_repaired.docx
@@ -201,7 +201,7 @@
         <w:rPr>
           <w:lang w:val="en-US"/>
         </w:rPr>
-        <w:t xml:space="preserve">(r) and the associated time‑dilation factor (D_SSZ(r)), and show that micrometre‑to‑millimetre height differences between qubits produce deterministic, geometric phase shifts on the order of (10⁻¹⁹) seconds per second per millimetre. Although individually tiny, these shifts accumulate across millions of gates and represent a previously overlooked source of systematic error. We calculate critical scales, introduce the concept of segment‑coherent zones, derive gate timing correction formulas, and perform realistic 16‑qubit simulations in Qiskit. We also outline experimental protocols for verifying </w:t>
+        <w:t xml:space="preserve">(r) and the associated time‑dilation factor (D_SSZ(r)), and show that micrometre‑to‑millimetre height differences between qubits produce deterministic, geometric phase shifts on the order of (10⁻¹⁹) seconds per second per millimetre. Although individually tiny, these shifts accumulate across millions of gates and represent a previously unmodeled source of deterministic bias. We calculate critical scales, introduce the concept of segment‑coherent zones, derive gate timing correction formulas, and perform realistic 16‑qubit simulations in Qiskit. We also outline experimental protocols for verifying </w:t>
       </w:r>
     </w:p>
     <w:p>
@@ -215,7 +215,7 @@
         <w:rPr>
           <w:lang w:val="en-US"/>
         </w:rPr>
-        <w:t xml:space="preserve">SSZ predictions on superconducting and trapped‑ion platforms. Our results indicate that SSZ corrections can, under didactic scaling (S=10⁸), improve gate fidelities by ~0.1% and reduce systematic errors ten-fold in stress-test simulations. Any quoted fidelity changes refer to the scaled regime and are not predictions for present-day Earth-scale devices (S=1), and are straightforward at the software level; detectability is limited by present noise floors through software without hardware changes. Important caveat: All simulation results use a didactic scaling factor S = 10⁸; the true Earth-scale fidelity impact is ~10⁻²¹, far below current thresholds (see Sec. 6). Set S = 1 for real-world predictions. This paper provides a comprehensive, accessible introduction to SSZ, demonstrating how spacetime geometry influences qubit performance and how these effects can be tested today. </w:t>
+        <w:t xml:space="preserve">SSZ predictions on superconducting and trapped‑ion platforms. Our results indicate that SSZ corrections can, under didactic scaling (S=10⁸), improve gate fidelities by ~0.1% and reduce systematic errors ten-fold in stress-test simulations. Any quoted fidelity changes refer to the scaled regime and are not predictions for present-day Earth-scale devices (S=1), and are straightforward at the software level; detectability is limited by present noise floors through software without hardware changes. Important caveat: All simulation results use a didactic scaling factor S = 10⁸; the true Earth-scale fidelity impact is ~10⁻²¹, far below current thresholds (see Sec. 6). Set S = 1 for real-world predictions. This paper provides a comprehensive, accessible introduction to SSZ, demonstrating how spacetime geometry influences qubit performance and how these effects can, in principle, be tested with future platforms. </w:t>
       </w:r>
     </w:p>
     <w:p>
@@ -1737,7 +1737,7 @@
         <w:t>Gate timing and phase drift:</w:t>
       </w:r>
       <w:r>
-        <w:t xml:space="preserve"> We derive the phase drift per gate and a simple correction formula for gate durations. We show that although individual corrections are minuscule, their cumulative effect over many gates is measurable (Sec. 4). </w:t>
+        <w:t xml:space="preserve"> We derive the phase drift per gate and a simple correction formula for gate durations. We show that although individual corrections are minuscule, their cumulative effect over many gates is modelable and, in scaled simulations, detectable (Sec. 4). </w:t>
       </w:r>
     </w:p>
     <w:p>
@@ -8191,7 +8191,7 @@
         <w:jc w:val="center"/>
       </w:pPr>
       <w:r>
-        <w:t xml:space="preserve">Table 5 summarises the results. Without SSZ correction the mean gate fidelity is 99.12 % with a standard deviation of 0.15 %. Incorporating SSZ corrections raises the mean fidelity to 99.23 % and reduces the standard deviation to 0.12 %. The systematic error (deviation from the ideal process averaged over random seeds) decreases from 1.2 × 10⁻⁵ to 1.1 × 10⁻⁶—an order‑of‑magnitude improvement. Although the absolute improvement (0.11 %) is modest, it is comparable to gains achieved through hardware refinements and requires no hardware changes. These modest‑looking numbers hide the cumulative nature of the SSZ effect. The per‑gate phase drift predicted in Sec. 4.1 is of order 10⁻¹⁶ radians for a 1 mm height difference and a 50 ns gate, which is undetectable on its own. However, a circuit with 10⁶ gates accumulates this drift across every operation. In our simulations the height differences were drawn from a millimetre‑scale distribution and the circuits contained thousands of gates. Under these conditions small biases compound and interact with other noise channels, leading to a measurable reduction in fidelity. The SSZ correction removes a systematic timing offset from each gate, thereby mitigating this accumulation. As circuits grow longer and more complex the cumulative benefit becomes increasingly significant. </w:t>
+        <w:t xml:space="preserve">Table 5 summarises the results. Without SSZ correction the mean gate fidelity is 99.12 % with a standard deviation of 0.15 %. Incorporating SSZ corrections raises the mean fidelity to 99.23 % and reduces the standard deviation to 0.12 %. The systematic error (deviation from the ideal process averaged over random seeds) decreases from 1.2 × 10⁻⁵ to 1.1 × 10⁻⁶—an order‑of‑magnitude improvement. Although the absolute improvement (0.11 %) is modest, it is comparable to gains achieved through hardware refinements and requires no hardware changes. These modest‑looking numbers hide the cumulative nature of the SSZ effect. The per‑gate phase drift predicted in Sec. 4.1 is of order 10⁻¹⁶ radians for a 1 mm height difference and a 50 ns gate, which is undetectable on its own. However, a circuit with 10⁶ gates accumulates this drift across every operation. In our simulations the height differences were drawn from a millimetre‑scale distribution and the circuits contained thousands of gates. Under these conditions small biases compound and interact with other noise channels, leading to a reduction in fidelity visible under didactic scaling (S=10⁸). The SSZ correction removes a systematic timing offset from each gate, thereby mitigating this accumulation. As circuits grow longer and more complex the cumulative benefit becomes increasingly significant. </w:t>
       </w:r>
     </w:p>
     <w:p>
@@ -11007,7 +11007,7 @@
         <w:ind w:left="-5"/>
       </w:pPr>
       <w:r>
-        <w:t xml:space="preserve">We have presented a detailed and accessible account of how Segmented Spacetime (SSZ) influences qubit performance. Starting from the definition of segment density and time‑dilation factor, we derived formulas for the height‑dependent gradient, phase drift per gate and gate timing corrections. We calculated critical scales where SSZ becomes relevant, introduced segment‑coherent zones to guide chip design and calibration, and explained how to derive and apply timing correction factors. Through realistic Qiskit simulations, we demonstrated that SSZ corrections improve gate fidelities by approximately 0.1 % and reduce systematic errors by an order of magnitude. Finally, we proposed experimental protocols for superconducting and trapped‑ion platforms and discussed the significance, limitations and future directions of SSZ. (Note: This improvement is observed in didactically scaled simulations; at true Earth-scale, SSZ effects are ~10⁻¹⁴ of base rates.) </w:t>
+        <w:t xml:space="preserve">We have presented a detailed and accessible account of how Segmented Spacetime (SSZ) influences qubit performance. Starting from the definition of segment density and time‑dilation factor, we derived formulas for the height‑dependent gradient, phase drift per gate and gate timing corrections. We calculated critical scales where SSZ becomes relevant, introduced segment‑coherent zones to guide chip design and calibration, and explained how to derive and apply timing correction factors. Through realistic Qiskit simulations, we demonstrated that SSZ corrections improve gate fidelities by approximately 0.1 % under didactic scaling (S=10⁸; true Earth-scale impact ~10⁻²¹) and reduce systematic errors by an order of magnitude. Finally, we proposed experimental protocols for superconducting and trapped‑ion platforms and discussed the significance, limitations and future directions of SSZ. (Note: This improvement is observed in didactically scaled simulations; at true Earth-scale, SSZ effects are ~10⁻¹⁴ of base rates.) </w:t>
       </w:r>
     </w:p>
     <w:p>
@@ -11024,7 +11024,7 @@
         <w:t>some qubit errors are geometric, deterministic and therefore predictable</w:t>
       </w:r>
       <w:r>
-        <w:t xml:space="preserve">. These errors arise from micrometre‑to‑millimetre height differences in the gravitational field and accumulate over long circuits. By measuring qubit heights and applying SSZ timing corrections—software operations with no hardware cost— we can systematically reduce this error source. As quantum processors scale to larger numbers of qubits and deeper circuits, such corrections will become increasingly important. Beyond practical implications, detecting SSZ effects would bring gravitational physics into the realm of quantum information science, opening a new frontier in testing the interplay between gravity and quantum computation. </w:t>
+        <w:t xml:space="preserve">. These errors arise from micrometre‑to‑millimetre height differences in the gravitational field and accumulate over long circuits. By measuring qubit heights and applying SSZ timing corrections—software operations with no hardware cost— we can systematically reduce this error source. As quantum processors scale to larger numbers of qubits and deeper circuits, such corrections will become increasingly important—though detection requires platforms beyond current superconducting devices (see Paper C for feasibility analysis). Beyond practical implications, detecting SSZ effects would bring gravitational physics into the realm of quantum information science, opening a new frontier in testing the interplay between gravity and quantum computation. </w:t>
       </w:r>
     </w:p>
     <w:p>

</xml_diff>

<commit_message>
fix: precision anti-overclaiming wording (Round 4) — Papers A+C - Paper A: 7 fixes (regime qualifiers, stress-test framing, feasibility caveat) - Paper C: 2 fixes (detection-regime caveat, optical-clock systematics) - No formulas changed, language only
</commit_message>
<xml_diff>
--- a/paper_final/SSZ_Paper_A_Segmented Spacetime Geometry for Qubit Optimization_repaired.docx
+++ b/paper_final/SSZ_Paper_A_Segmented Spacetime Geometry for Qubit Optimization_repaired.docx
@@ -201,7 +201,7 @@
         <w:rPr>
           <w:lang w:val="en-US"/>
         </w:rPr>
-        <w:t xml:space="preserve">(r) and the associated time‑dilation factor (D_SSZ(r)), and show that micrometre‑to‑millimetre height differences between qubits produce deterministic, geometric phase shifts on the order of (10⁻¹⁹) seconds per second per millimetre. Although individually tiny, these shifts accumulate across millions of gates and represent a previously unmodeled source of deterministic bias. We calculate critical scales, introduce the concept of segment‑coherent zones, derive gate timing correction formulas, and perform realistic 16‑qubit simulations in Qiskit. We also outline experimental protocols for verifying </w:t>
+        <w:t xml:space="preserve">(r) and the associated time‑dilation factor (D_SSZ(r)), and show that micrometre‑to‑millimetre height differences between qubits produce deterministic, geometric phase shifts on the order of (10⁻¹⁹) seconds per second per millimetre. Although individually tiny, these shifts can in principle accumulate across millions of gates and may constitute an unmodelled deterministic contribution to systematic phase bias (subdominant at Earth-scale; see Sec. 6 for detectability). We calculate critical scales, introduce the concept of segment‑coherent zones, derive gate timing correction formulas, and perform realistic 16‑qubit simulations in Qiskit. We also outline experimental protocols for verifying </w:t>
       </w:r>
     </w:p>
     <w:p>
@@ -215,7 +215,7 @@
         <w:rPr>
           <w:lang w:val="en-US"/>
         </w:rPr>
-        <w:t xml:space="preserve">SSZ predictions on superconducting and trapped‑ion platforms. Our results indicate that SSZ corrections can, under didactic scaling (S=10⁸), improve gate fidelities by ~0.1% and reduce systematic errors ten-fold in stress-test simulations. Any quoted fidelity changes refer to the scaled regime and are not predictions for present-day Earth-scale devices (S=1), and are straightforward at the software level; detectability is limited by present noise floors through software without hardware changes. Important caveat: All simulation results use a didactic scaling factor S = 10⁸; the true Earth-scale fidelity impact is ~10⁻²¹, far below current thresholds (see Sec. 6). Set S = 1 for real-world predictions. This paper provides a comprehensive, accessible introduction to SSZ, demonstrating how spacetime geometry influences qubit performance and how these effects can, in principle, be tested with future platforms. </w:t>
+        <w:t xml:space="preserve">SSZ predictions on superconducting and trapped‑ion platforms. Our results indicate that SSZ corrections can, under didactic scaling (S=10⁸), improve gate fidelities by ~0.1% and reduce systematic errors ten-fold in stress-test simulations. Any quoted fidelity changes refer to the scaled regime and are not predictions for present-day Earth-scale devices (S=1), and are straightforward at the software level; detectability is limited by present noise floors through software without hardware changes. Important caveat: All simulation results use a didactic scaling factor S = 10⁸; the true Earth-scale fidelity impact is ~10⁻²¹, far below current thresholds (see Sec. 6). Set S = 1 for real-world predictions. This paper provides a comprehensive, accessible introduction to SSZ, demonstrating how spacetime geometry influences qubit performance and how the framework can be constrained today (upper bounds) and directly tested in the optical-clock detection regime. </w:t>
       </w:r>
     </w:p>
     <w:p>
@@ -1737,7 +1737,7 @@
         <w:t>Gate timing and phase drift:</w:t>
       </w:r>
       <w:r>
-        <w:t xml:space="preserve"> We derive the phase drift per gate and a simple correction formula for gate durations. We show that although individual corrections are minuscule, their cumulative effect over many gates is modelable and, in scaled simulations, detectable (Sec. 4). </w:t>
+        <w:t xml:space="preserve"> We derive the phase drift per gate and a simple correction formula for gate durations. We show that although individual corrections are minuscule, their cumulative effect over many gates is in principle resolvable in the detection regime (e.g., optical-clock precision), while superconducting platforms remain upper-bound / bound-regime tests (see Sec. 6 and Paper D) (Sec. 4). </w:t>
       </w:r>
     </w:p>
     <w:p>
@@ -4638,7 +4638,7 @@
         <w:ind w:left="-5"/>
       </w:pPr>
       <w:r>
-        <w:t xml:space="preserve">To assess the relevance of SSZ corrections we compute the segment density difference (ΔΞ) and the corresponding time drift per second for various height differences. Table 3 lists these values from nanometre to metre scales and labels their relevance. Nanometre variations produce drifts of (10⁻²⁵) s/s—negligible compared with other noise sources—whereas millimetre‑to‑centimetre differences yield drifts of 10⁻¹⁹–10⁻¹⁷ s/s, within reach of optical clocks. The bar chart in Figure 5 summarises the regimes where SSZ corrections are negligible, measurable, significant or dominant. </w:t>
+        <w:t xml:space="preserve">To assess the relevance of SSZ corrections we compute the segment density difference (ΔΞ) and the corresponding time drift per second for various height differences. Table 3 lists these values from nanometre to metre scales and labels their relevance. Nanometre variations produce drifts of (10⁻²⁵) s/s—negligible compared with other noise sources—whereas millimetre‑to‑centimetre differences yield drifts of 10⁻¹⁹–10⁻¹⁷ s/s, which become testable only in optical-clock–class timing/phase metrology; superconducting qubit platforms at mm-scale operate in an upper-bound regime. The bar chart in Figure 5 summarises the regimes where SSZ corrections are negligible, modelable, significant or dominant. </w:t>
       </w:r>
       <w:r>
         <w:rPr>
@@ -8191,7 +8191,7 @@
         <w:jc w:val="center"/>
       </w:pPr>
       <w:r>
-        <w:t xml:space="preserve">Table 5 summarises the results. Without SSZ correction the mean gate fidelity is 99.12 % with a standard deviation of 0.15 %. Incorporating SSZ corrections raises the mean fidelity to 99.23 % and reduces the standard deviation to 0.12 %. The systematic error (deviation from the ideal process averaged over random seeds) decreases from 1.2 × 10⁻⁵ to 1.1 × 10⁻⁶—an order‑of‑magnitude improvement. Although the absolute improvement (0.11 %) is modest, it is comparable to gains achieved through hardware refinements and requires no hardware changes. These modest‑looking numbers hide the cumulative nature of the SSZ effect. The per‑gate phase drift predicted in Sec. 4.1 is of order 10⁻¹⁶ radians for a 1 mm height difference and a 50 ns gate, which is undetectable on its own. However, a circuit with 10⁶ gates accumulates this drift across every operation. In our simulations the height differences were drawn from a millimetre‑scale distribution and the circuits contained thousands of gates. Under these conditions small biases compound and interact with other noise channels, leading to a reduction in fidelity visible under didactic scaling (S=10⁸). The SSZ correction removes a systematic timing offset from each gate, thereby mitigating this accumulation. As circuits grow longer and more complex the cumulative benefit becomes increasingly significant. </w:t>
+        <w:t xml:space="preserve">Table 5 summarises the results. Without SSZ correction the mean gate fidelity is 99.12 % with a standard deviation of 0.15 %. Incorporating SSZ corrections raises the mean fidelity to 99.23 % and reduces the standard deviation to 0.12 %. The systematic error (deviation from the ideal process averaged over random seeds) decreases from 1.2 × 10⁻⁵ to 1.1 × 10⁻⁶—an order‑of‑magnitude improvement. Although the absolute improvement (0.11 %) is modest, it is comparable to gains achieved through hardware refinements and requires no hardware changes. These modest‑looking numbers hide the cumulative nature of the SSZ effect. The per‑gate phase drift predicted in Sec. 4.1 is of order 10⁻¹⁶ radians for a 1 mm height difference and a 50 ns gate, which is undetectable on its own. However, a circuit with 10⁶ gates accumulates this drift across every operation. In our simulations the height differences were drawn from a millimetre‑scale distribution and the circuits contained thousands of gates. Under these conditions small biases compound and interact with other noise channels, leading to a statistically resolvable reduction in fidelity in the stress-test (scaled) regime. The SSZ correction removes a systematic timing offset from each gate, thereby mitigating this accumulation. As circuits grow longer and more complex the cumulative benefit becomes increasingly significant. </w:t>
       </w:r>
     </w:p>
     <w:p>
@@ -9028,7 +9028,7 @@
         <w:ind w:left="-5"/>
       </w:pPr>
       <w:r>
-        <w:t xml:space="preserve">Observing SSZ effects demands high precision across several parameters. Table 6 summarises the required precision and compares it to state‑of‑the‑art capabilities. AFM and interferometric techniques can measure and control heights with sub‑micrometre accuracy; optical lattice clocks can measure time at the (10⁻¹⁹) level; arbitrary waveform generators offer sub‑picosecond timing control; and randomised benchmarking can resolve fidelity differences below 0.01 %. These values indicate that all aspects of the proposed experiments are technologically feasible today. </w:t>
+        <w:t xml:space="preserve">Observing SSZ effects demands high precision across several parameters. Table 6 summarises the required precision and compares it to state‑of‑the‑art capabilities. AFM and interferometric techniques can measure and control heights with sub‑micrometre accuracy; optical lattice clocks can measure time at the (10⁻¹⁹) level; arbitrary waveform generators offer sub‑picosecond timing control; and randomised benchmarking can resolve fidelity differences below 0.01 %. These values indicate that the metrology and control requirements are technologically feasible today; direct detection of Earth-scale SSZ phase drift requires optical-clock–class precision and/or larger Δh (see bound vs detection regime). </w:t>
       </w:r>
     </w:p>
     <w:p>
@@ -11007,7 +11007,7 @@
         <w:ind w:left="-5"/>
       </w:pPr>
       <w:r>
-        <w:t xml:space="preserve">We have presented a detailed and accessible account of how Segmented Spacetime (SSZ) influences qubit performance. Starting from the definition of segment density and time‑dilation factor, we derived formulas for the height‑dependent gradient, phase drift per gate and gate timing corrections. We calculated critical scales where SSZ becomes relevant, introduced segment‑coherent zones to guide chip design and calibration, and explained how to derive and apply timing correction factors. Through realistic Qiskit simulations, we demonstrated that SSZ corrections improve gate fidelities by approximately 0.1 % under didactic scaling (S=10⁸; true Earth-scale impact ~10⁻²¹) and reduce systematic errors by an order of magnitude. Finally, we proposed experimental protocols for superconducting and trapped‑ion platforms and discussed the significance, limitations and future directions of SSZ. (Note: This improvement is observed in didactically scaled simulations; at true Earth-scale, SSZ effects are ~10⁻¹⁴ of base rates.) </w:t>
+        <w:t xml:space="preserve">We have presented a detailed and accessible account of how Segmented Spacetime (SSZ) influences qubit performance. Starting from the definition of segment density and time‑dilation factor, we derived formulas for the height‑dependent gradient, phase drift per gate and gate timing corrections. We calculated critical scales where SSZ becomes relevant, introduced segment‑coherent zones to guide chip design and calibration, and explained how to derive and apply timing correction factors. Through realistic Qiskit simulations, we demonstrated (in scaled stress-test simulations) that SSZ corrections improve gate fidelities by approximately 0.1 % under didactic scaling (S=10⁸; true Earth-scale impact ~10⁻²¹) and reduce systematic errors by an order of magnitude. Finally, we proposed experimental protocols for superconducting and trapped‑ion platforms and discussed the significance, limitations and future directions of SSZ. (Note: This improvement is observed in didactically scaled simulations; at true Earth-scale, SSZ effects are ~10⁻¹⁴ of base rates.) </w:t>
       </w:r>
     </w:p>
     <w:p>

</xml_diff>